<commit_message>
feat: implement JavaFX login flow
</commit_message>
<xml_diff>
--- a/Slot14/HSF302_DE200046_ReportSlot14.docx
+++ b/Slot14/HSF302_DE200046_ReportSlot14.docx
@@ -52,6 +52,12 @@
     </w:p>
     <w:sdt>
       <w:sdtPr>
+        <w:rPr>
+          <w:rFonts w:ascii="Times New Roman" w:eastAsia="Times New Roman" w:hAnsi="Times New Roman" w:cstheme="minorBidi"/>
+          <w:b w:val="0"/>
+          <w:bCs w:val="0"/>
+          <w:szCs w:val="22"/>
+        </w:rPr>
         <w:id w:val="-1240627934"/>
         <w:docPartObj>
           <w:docPartGallery w:val="Table of Contents"/>
@@ -60,9 +66,7 @@
       </w:sdtPr>
       <w:sdtEndPr>
         <w:rPr>
-          <w:rFonts w:ascii="Times New Roman" w:eastAsia="Times New Roman" w:hAnsi="Times New Roman" w:cstheme="minorBidi"/>
           <w:noProof/>
-          <w:szCs w:val="22"/>
         </w:rPr>
       </w:sdtEndPr>
       <w:sdtContent>
@@ -82,6 +86,8 @@
             </w:tabs>
             <w:rPr>
               <w:rFonts w:asciiTheme="minorHAnsi" w:eastAsiaTheme="minorEastAsia" w:hAnsiTheme="minorHAnsi"/>
+              <w:b/>
+              <w:bCs/>
               <w:noProof/>
               <w:color w:val="auto"/>
               <w:kern w:val="2"/>
@@ -92,24 +98,59 @@
             </w:rPr>
           </w:pPr>
           <w:r>
+            <w:rPr>
+              <w:b/>
+              <w:bCs/>
+            </w:rPr>
             <w:fldChar w:fldCharType="begin"/>
           </w:r>
           <w:r>
+            <w:rPr>
+              <w:b/>
+              <w:bCs/>
+            </w:rPr>
             <w:instrText xml:space="preserve"> TOC \o "1-3" \h \z \u </w:instrText>
           </w:r>
           <w:r>
+            <w:rPr>
+              <w:b/>
+              <w:bCs/>
+            </w:rPr>
             <w:fldChar w:fldCharType="separate"/>
           </w:r>
-          <w:hyperlink w:anchor="_Toc243990115" w:history="1">
+          <w:hyperlink w:anchor="_Toc243990502" w:history="1">
             <w:r>
               <w:rPr>
                 <w:rStyle w:val="Hyperlink"/>
+                <w:b/>
+                <w:bCs/>
                 <w:noProof/>
               </w:rPr>
-              <w:t>1 STEP 1 – Tạo project (Spring Boot 4.1.1)</w:t>
+              <w:t>1</w:t>
             </w:r>
             <w:r>
               <w:rPr>
+                <w:rStyle w:val="Hyperlink"/>
+                <w:b/>
+                <w:bCs/>
+                <w:noProof/>
+                <w:lang w:val="vi-VN"/>
+              </w:rPr>
+              <w:t xml:space="preserve"> . </w:t>
+            </w:r>
+            <w:r>
+              <w:rPr>
+                <w:rStyle w:val="Hyperlink"/>
+                <w:b/>
+                <w:bCs/>
+                <w:noProof/>
+              </w:rPr>
+              <w:t>STEP 1 – Tạo project (Spring Boot 4.1.1)</w:t>
+            </w:r>
+            <w:r>
+              <w:rPr>
+                <w:b/>
+                <w:bCs/>
                 <w:noProof/>
                 <w:webHidden/>
               </w:rPr>
@@ -117,6 +158,8 @@
             </w:r>
             <w:r>
               <w:rPr>
+                <w:b/>
+                <w:bCs/>
                 <w:noProof/>
                 <w:webHidden/>
               </w:rPr>
@@ -124,19 +167,25 @@
             </w:r>
             <w:r>
               <w:rPr>
+                <w:b/>
+                <w:bCs/>
                 <w:noProof/>
                 <w:webHidden/>
               </w:rPr>
-              <w:instrText xml:space="preserve"> PAGEREF _Toc243990115 \h </w:instrText>
+              <w:instrText xml:space="preserve"> PAGEREF _Toc243990502 \h </w:instrText>
             </w:r>
             <w:r>
               <w:rPr>
+                <w:b/>
+                <w:bCs/>
                 <w:noProof/>
                 <w:webHidden/>
               </w:rPr>
             </w:r>
             <w:r>
               <w:rPr>
+                <w:b/>
+                <w:bCs/>
                 <w:noProof/>
                 <w:webHidden/>
               </w:rPr>
@@ -144,13 +193,17 @@
             </w:r>
             <w:r>
               <w:rPr>
+                <w:b/>
+                <w:bCs/>
                 <w:noProof/>
                 <w:webHidden/>
               </w:rPr>
-              <w:t>2</w:t>
+              <w:t>1</w:t>
             </w:r>
             <w:r>
               <w:rPr>
+                <w:b/>
+                <w:bCs/>
                 <w:noProof/>
                 <w:webHidden/>
               </w:rPr>
@@ -166,6 +219,8 @@
             </w:tabs>
             <w:rPr>
               <w:rFonts w:asciiTheme="minorHAnsi" w:eastAsiaTheme="minorEastAsia" w:hAnsiTheme="minorHAnsi"/>
+              <w:b/>
+              <w:bCs/>
               <w:noProof/>
               <w:color w:val="auto"/>
               <w:kern w:val="2"/>
@@ -175,16 +230,39 @@
               <w14:ligatures w14:val="standardContextual"/>
             </w:rPr>
           </w:pPr>
-          <w:hyperlink w:anchor="_Toc243990116" w:history="1">
+          <w:hyperlink w:anchor="_Toc243990503" w:history="1">
             <w:r>
               <w:rPr>
                 <w:rStyle w:val="Hyperlink"/>
+                <w:b/>
+                <w:bCs/>
                 <w:noProof/>
               </w:rPr>
-              <w:t>2 STEP 2 – Cài Bootstrap offline</w:t>
+              <w:t>2</w:t>
             </w:r>
             <w:r>
               <w:rPr>
+                <w:rStyle w:val="Hyperlink"/>
+                <w:b/>
+                <w:bCs/>
+                <w:noProof/>
+                <w:lang w:val="vi-VN"/>
+              </w:rPr>
+              <w:t xml:space="preserve"> . </w:t>
+            </w:r>
+            <w:r>
+              <w:rPr>
+                <w:rStyle w:val="Hyperlink"/>
+                <w:b/>
+                <w:bCs/>
+                <w:noProof/>
+              </w:rPr>
+              <w:t>STEP 2 – Cài Bootstrap offline</w:t>
+            </w:r>
+            <w:r>
+              <w:rPr>
+                <w:b/>
+                <w:bCs/>
                 <w:noProof/>
                 <w:webHidden/>
               </w:rPr>
@@ -192,6 +270,8 @@
             </w:r>
             <w:r>
               <w:rPr>
+                <w:b/>
+                <w:bCs/>
                 <w:noProof/>
                 <w:webHidden/>
               </w:rPr>
@@ -199,19 +279,25 @@
             </w:r>
             <w:r>
               <w:rPr>
+                <w:b/>
+                <w:bCs/>
                 <w:noProof/>
                 <w:webHidden/>
               </w:rPr>
-              <w:instrText xml:space="preserve"> PAGEREF _Toc243990116 \h </w:instrText>
+              <w:instrText xml:space="preserve"> PAGEREF _Toc243990503 \h </w:instrText>
             </w:r>
             <w:r>
               <w:rPr>
+                <w:b/>
+                <w:bCs/>
                 <w:noProof/>
                 <w:webHidden/>
               </w:rPr>
             </w:r>
             <w:r>
               <w:rPr>
+                <w:b/>
+                <w:bCs/>
                 <w:noProof/>
                 <w:webHidden/>
               </w:rPr>
@@ -219,6 +305,8 @@
             </w:r>
             <w:r>
               <w:rPr>
+                <w:b/>
+                <w:bCs/>
                 <w:noProof/>
                 <w:webHidden/>
               </w:rPr>
@@ -226,6 +314,8 @@
             </w:r>
             <w:r>
               <w:rPr>
+                <w:b/>
+                <w:bCs/>
                 <w:noProof/>
                 <w:webHidden/>
               </w:rPr>
@@ -241,6 +331,8 @@
             </w:tabs>
             <w:rPr>
               <w:rFonts w:asciiTheme="minorHAnsi" w:eastAsiaTheme="minorEastAsia" w:hAnsiTheme="minorHAnsi"/>
+              <w:b/>
+              <w:bCs/>
               <w:noProof/>
               <w:color w:val="auto"/>
               <w:kern w:val="2"/>
@@ -250,16 +342,39 @@
               <w14:ligatures w14:val="standardContextual"/>
             </w:rPr>
           </w:pPr>
-          <w:hyperlink w:anchor="_Toc243990117" w:history="1">
+          <w:hyperlink w:anchor="_Toc243990504" w:history="1">
             <w:r>
               <w:rPr>
                 <w:rStyle w:val="Hyperlink"/>
+                <w:b/>
+                <w:bCs/>
                 <w:noProof/>
               </w:rPr>
-              <w:t>3 STEP 3 – Chuẩn bị SQL Server</w:t>
+              <w:t>3</w:t>
             </w:r>
             <w:r>
               <w:rPr>
+                <w:rStyle w:val="Hyperlink"/>
+                <w:b/>
+                <w:bCs/>
+                <w:noProof/>
+                <w:lang w:val="vi-VN"/>
+              </w:rPr>
+              <w:t xml:space="preserve"> . </w:t>
+            </w:r>
+            <w:r>
+              <w:rPr>
+                <w:rStyle w:val="Hyperlink"/>
+                <w:b/>
+                <w:bCs/>
+                <w:noProof/>
+              </w:rPr>
+              <w:t>STEP 3 – Chuẩn bị SQL Server</w:t>
+            </w:r>
+            <w:r>
+              <w:rPr>
+                <w:b/>
+                <w:bCs/>
                 <w:noProof/>
                 <w:webHidden/>
               </w:rPr>
@@ -267,6 +382,8 @@
             </w:r>
             <w:r>
               <w:rPr>
+                <w:b/>
+                <w:bCs/>
                 <w:noProof/>
                 <w:webHidden/>
               </w:rPr>
@@ -274,19 +391,25 @@
             </w:r>
             <w:r>
               <w:rPr>
+                <w:b/>
+                <w:bCs/>
                 <w:noProof/>
                 <w:webHidden/>
               </w:rPr>
-              <w:instrText xml:space="preserve"> PAGEREF _Toc243990117 \h </w:instrText>
+              <w:instrText xml:space="preserve"> PAGEREF _Toc243990504 \h </w:instrText>
             </w:r>
             <w:r>
               <w:rPr>
+                <w:b/>
+                <w:bCs/>
                 <w:noProof/>
                 <w:webHidden/>
               </w:rPr>
             </w:r>
             <w:r>
               <w:rPr>
+                <w:b/>
+                <w:bCs/>
                 <w:noProof/>
                 <w:webHidden/>
               </w:rPr>
@@ -294,13 +417,17 @@
             </w:r>
             <w:r>
               <w:rPr>
+                <w:b/>
+                <w:bCs/>
                 <w:noProof/>
                 <w:webHidden/>
               </w:rPr>
-              <w:t>3</w:t>
+              <w:t>2</w:t>
             </w:r>
             <w:r>
               <w:rPr>
+                <w:b/>
+                <w:bCs/>
                 <w:noProof/>
                 <w:webHidden/>
               </w:rPr>
@@ -316,6 +443,8 @@
             </w:tabs>
             <w:rPr>
               <w:rFonts w:asciiTheme="minorHAnsi" w:eastAsiaTheme="minorEastAsia" w:hAnsiTheme="minorHAnsi"/>
+              <w:b/>
+              <w:bCs/>
               <w:noProof/>
               <w:color w:val="auto"/>
               <w:kern w:val="2"/>
@@ -325,16 +454,39 @@
               <w14:ligatures w14:val="standardContextual"/>
             </w:rPr>
           </w:pPr>
-          <w:hyperlink w:anchor="_Toc243990118" w:history="1">
+          <w:hyperlink w:anchor="_Toc243990505" w:history="1">
             <w:r>
               <w:rPr>
                 <w:rStyle w:val="Hyperlink"/>
+                <w:b/>
+                <w:bCs/>
                 <w:noProof/>
               </w:rPr>
-              <w:t>4 STEP 4 – Cấu hình application.properties và messages.properties</w:t>
+              <w:t>4</w:t>
             </w:r>
             <w:r>
               <w:rPr>
+                <w:rStyle w:val="Hyperlink"/>
+                <w:b/>
+                <w:bCs/>
+                <w:noProof/>
+                <w:lang w:val="vi-VN"/>
+              </w:rPr>
+              <w:t xml:space="preserve"> . </w:t>
+            </w:r>
+            <w:r>
+              <w:rPr>
+                <w:rStyle w:val="Hyperlink"/>
+                <w:b/>
+                <w:bCs/>
+                <w:noProof/>
+              </w:rPr>
+              <w:t>STEP 4 – Cấu hình application.properties và messages.properties</w:t>
+            </w:r>
+            <w:r>
+              <w:rPr>
+                <w:b/>
+                <w:bCs/>
                 <w:noProof/>
                 <w:webHidden/>
               </w:rPr>
@@ -342,6 +494,8 @@
             </w:r>
             <w:r>
               <w:rPr>
+                <w:b/>
+                <w:bCs/>
                 <w:noProof/>
                 <w:webHidden/>
               </w:rPr>
@@ -349,19 +503,25 @@
             </w:r>
             <w:r>
               <w:rPr>
+                <w:b/>
+                <w:bCs/>
                 <w:noProof/>
                 <w:webHidden/>
               </w:rPr>
-              <w:instrText xml:space="preserve"> PAGEREF _Toc243990118 \h </w:instrText>
+              <w:instrText xml:space="preserve"> PAGEREF _Toc243990505 \h </w:instrText>
             </w:r>
             <w:r>
               <w:rPr>
+                <w:b/>
+                <w:bCs/>
                 <w:noProof/>
                 <w:webHidden/>
               </w:rPr>
             </w:r>
             <w:r>
               <w:rPr>
+                <w:b/>
+                <w:bCs/>
                 <w:noProof/>
                 <w:webHidden/>
               </w:rPr>
@@ -369,13 +529,17 @@
             </w:r>
             <w:r>
               <w:rPr>
+                <w:b/>
+                <w:bCs/>
                 <w:noProof/>
                 <w:webHidden/>
               </w:rPr>
-              <w:t>3</w:t>
+              <w:t>2</w:t>
             </w:r>
             <w:r>
               <w:rPr>
+                <w:b/>
+                <w:bCs/>
                 <w:noProof/>
                 <w:webHidden/>
               </w:rPr>
@@ -391,6 +555,8 @@
             </w:tabs>
             <w:rPr>
               <w:rFonts w:asciiTheme="minorHAnsi" w:eastAsiaTheme="minorEastAsia" w:hAnsiTheme="minorHAnsi"/>
+              <w:b/>
+              <w:bCs/>
               <w:noProof/>
               <w:color w:val="auto"/>
               <w:kern w:val="2"/>
@@ -400,16 +566,39 @@
               <w14:ligatures w14:val="standardContextual"/>
             </w:rPr>
           </w:pPr>
-          <w:hyperlink w:anchor="_Toc243990119" w:history="1">
+          <w:hyperlink w:anchor="_Toc243990506" w:history="1">
             <w:r>
               <w:rPr>
                 <w:rStyle w:val="Hyperlink"/>
+                <w:b/>
+                <w:bCs/>
                 <w:noProof/>
               </w:rPr>
-              <w:t>5 STEP 5 – Entity Student (TODO 18, TODO 1–3)</w:t>
+              <w:t>5</w:t>
             </w:r>
             <w:r>
               <w:rPr>
+                <w:rStyle w:val="Hyperlink"/>
+                <w:b/>
+                <w:bCs/>
+                <w:noProof/>
+                <w:lang w:val="vi-VN"/>
+              </w:rPr>
+              <w:t xml:space="preserve"> . </w:t>
+            </w:r>
+            <w:r>
+              <w:rPr>
+                <w:rStyle w:val="Hyperlink"/>
+                <w:b/>
+                <w:bCs/>
+                <w:noProof/>
+              </w:rPr>
+              <w:t>STEP 5 – Entity Student (TODO 18, TODO 1–3)</w:t>
+            </w:r>
+            <w:r>
+              <w:rPr>
+                <w:b/>
+                <w:bCs/>
                 <w:noProof/>
                 <w:webHidden/>
               </w:rPr>
@@ -417,6 +606,8 @@
             </w:r>
             <w:r>
               <w:rPr>
+                <w:b/>
+                <w:bCs/>
                 <w:noProof/>
                 <w:webHidden/>
               </w:rPr>
@@ -424,19 +615,25 @@
             </w:r>
             <w:r>
               <w:rPr>
+                <w:b/>
+                <w:bCs/>
                 <w:noProof/>
                 <w:webHidden/>
               </w:rPr>
-              <w:instrText xml:space="preserve"> PAGEREF _Toc243990119 \h </w:instrText>
+              <w:instrText xml:space="preserve"> PAGEREF _Toc243990506 \h </w:instrText>
             </w:r>
             <w:r>
               <w:rPr>
+                <w:b/>
+                <w:bCs/>
                 <w:noProof/>
                 <w:webHidden/>
               </w:rPr>
             </w:r>
             <w:r>
               <w:rPr>
+                <w:b/>
+                <w:bCs/>
                 <w:noProof/>
                 <w:webHidden/>
               </w:rPr>
@@ -444,13 +641,17 @@
             </w:r>
             <w:r>
               <w:rPr>
+                <w:b/>
+                <w:bCs/>
                 <w:noProof/>
                 <w:webHidden/>
               </w:rPr>
-              <w:t>3</w:t>
+              <w:t>2</w:t>
             </w:r>
             <w:r>
               <w:rPr>
+                <w:b/>
+                <w:bCs/>
                 <w:noProof/>
                 <w:webHidden/>
               </w:rPr>
@@ -466,6 +667,8 @@
             </w:tabs>
             <w:rPr>
               <w:rFonts w:asciiTheme="minorHAnsi" w:eastAsiaTheme="minorEastAsia" w:hAnsiTheme="minorHAnsi"/>
+              <w:b/>
+              <w:bCs/>
               <w:noProof/>
               <w:color w:val="auto"/>
               <w:kern w:val="2"/>
@@ -475,16 +678,39 @@
               <w14:ligatures w14:val="standardContextual"/>
             </w:rPr>
           </w:pPr>
-          <w:hyperlink w:anchor="_Toc243990120" w:history="1">
+          <w:hyperlink w:anchor="_Toc243990507" w:history="1">
             <w:r>
               <w:rPr>
                 <w:rStyle w:val="Hyperlink"/>
+                <w:b/>
+                <w:bCs/>
                 <w:noProof/>
               </w:rPr>
-              <w:t>6 STEP 6 – Repository (TODO 19)</w:t>
+              <w:t>6</w:t>
             </w:r>
             <w:r>
               <w:rPr>
+                <w:rStyle w:val="Hyperlink"/>
+                <w:b/>
+                <w:bCs/>
+                <w:noProof/>
+                <w:lang w:val="vi-VN"/>
+              </w:rPr>
+              <w:t xml:space="preserve"> . </w:t>
+            </w:r>
+            <w:r>
+              <w:rPr>
+                <w:rStyle w:val="Hyperlink"/>
+                <w:b/>
+                <w:bCs/>
+                <w:noProof/>
+              </w:rPr>
+              <w:t>STEP 6 – Repository (TODO 19)</w:t>
+            </w:r>
+            <w:r>
+              <w:rPr>
+                <w:b/>
+                <w:bCs/>
                 <w:noProof/>
                 <w:webHidden/>
               </w:rPr>
@@ -492,6 +718,8 @@
             </w:r>
             <w:r>
               <w:rPr>
+                <w:b/>
+                <w:bCs/>
                 <w:noProof/>
                 <w:webHidden/>
               </w:rPr>
@@ -499,19 +727,25 @@
             </w:r>
             <w:r>
               <w:rPr>
+                <w:b/>
+                <w:bCs/>
                 <w:noProof/>
                 <w:webHidden/>
               </w:rPr>
-              <w:instrText xml:space="preserve"> PAGEREF _Toc243990120 \h </w:instrText>
+              <w:instrText xml:space="preserve"> PAGEREF _Toc243990507 \h </w:instrText>
             </w:r>
             <w:r>
               <w:rPr>
+                <w:b/>
+                <w:bCs/>
                 <w:noProof/>
                 <w:webHidden/>
               </w:rPr>
             </w:r>
             <w:r>
               <w:rPr>
+                <w:b/>
+                <w:bCs/>
                 <w:noProof/>
                 <w:webHidden/>
               </w:rPr>
@@ -519,13 +753,17 @@
             </w:r>
             <w:r>
               <w:rPr>
+                <w:b/>
+                <w:bCs/>
                 <w:noProof/>
                 <w:webHidden/>
               </w:rPr>
-              <w:t>4</w:t>
+              <w:t>3</w:t>
             </w:r>
             <w:r>
               <w:rPr>
+                <w:b/>
+                <w:bCs/>
                 <w:noProof/>
                 <w:webHidden/>
               </w:rPr>
@@ -541,6 +779,8 @@
             </w:tabs>
             <w:rPr>
               <w:rFonts w:asciiTheme="minorHAnsi" w:eastAsiaTheme="minorEastAsia" w:hAnsiTheme="minorHAnsi"/>
+              <w:b/>
+              <w:bCs/>
               <w:noProof/>
               <w:color w:val="auto"/>
               <w:kern w:val="2"/>
@@ -550,16 +790,39 @@
               <w14:ligatures w14:val="standardContextual"/>
             </w:rPr>
           </w:pPr>
-          <w:hyperlink w:anchor="_Toc243990121" w:history="1">
+          <w:hyperlink w:anchor="_Toc243990508" w:history="1">
             <w:r>
               <w:rPr>
                 <w:rStyle w:val="Hyperlink"/>
+                <w:b/>
+                <w:bCs/>
                 <w:noProof/>
               </w:rPr>
-              <w:t>7 STEP 7 – Service + dữ liệu mẫu</w:t>
+              <w:t>7</w:t>
             </w:r>
             <w:r>
               <w:rPr>
+                <w:rStyle w:val="Hyperlink"/>
+                <w:b/>
+                <w:bCs/>
+                <w:noProof/>
+                <w:lang w:val="vi-VN"/>
+              </w:rPr>
+              <w:t xml:space="preserve"> . </w:t>
+            </w:r>
+            <w:r>
+              <w:rPr>
+                <w:rStyle w:val="Hyperlink"/>
+                <w:b/>
+                <w:bCs/>
+                <w:noProof/>
+              </w:rPr>
+              <w:t>STEP 7 – Service + dữ liệu mẫu</w:t>
+            </w:r>
+            <w:r>
+              <w:rPr>
+                <w:b/>
+                <w:bCs/>
                 <w:noProof/>
                 <w:webHidden/>
               </w:rPr>
@@ -567,6 +830,8 @@
             </w:r>
             <w:r>
               <w:rPr>
+                <w:b/>
+                <w:bCs/>
                 <w:noProof/>
                 <w:webHidden/>
               </w:rPr>
@@ -574,19 +839,25 @@
             </w:r>
             <w:r>
               <w:rPr>
+                <w:b/>
+                <w:bCs/>
                 <w:noProof/>
                 <w:webHidden/>
               </w:rPr>
-              <w:instrText xml:space="preserve"> PAGEREF _Toc243990121 \h </w:instrText>
+              <w:instrText xml:space="preserve"> PAGEREF _Toc243990508 \h </w:instrText>
             </w:r>
             <w:r>
               <w:rPr>
+                <w:b/>
+                <w:bCs/>
                 <w:noProof/>
                 <w:webHidden/>
               </w:rPr>
             </w:r>
             <w:r>
               <w:rPr>
+                <w:b/>
+                <w:bCs/>
                 <w:noProof/>
                 <w:webHidden/>
               </w:rPr>
@@ -594,13 +865,17 @@
             </w:r>
             <w:r>
               <w:rPr>
+                <w:b/>
+                <w:bCs/>
                 <w:noProof/>
                 <w:webHidden/>
               </w:rPr>
-              <w:t>4</w:t>
+              <w:t>3</w:t>
             </w:r>
             <w:r>
               <w:rPr>
+                <w:b/>
+                <w:bCs/>
                 <w:noProof/>
                 <w:webHidden/>
               </w:rPr>
@@ -616,6 +891,8 @@
             </w:tabs>
             <w:rPr>
               <w:rFonts w:asciiTheme="minorHAnsi" w:eastAsiaTheme="minorEastAsia" w:hAnsiTheme="minorHAnsi"/>
+              <w:b/>
+              <w:bCs/>
               <w:noProof/>
               <w:color w:val="auto"/>
               <w:kern w:val="2"/>
@@ -625,16 +902,39 @@
               <w14:ligatures w14:val="standardContextual"/>
             </w:rPr>
           </w:pPr>
-          <w:hyperlink w:anchor="_Toc243990122" w:history="1">
+          <w:hyperlink w:anchor="_Toc243990509" w:history="1">
             <w:r>
               <w:rPr>
                 <w:rStyle w:val="Hyperlink"/>
+                <w:b/>
+                <w:bCs/>
                 <w:noProof/>
               </w:rPr>
-              <w:t>8 STEP 8 – Controller (TODO 4–7)</w:t>
+              <w:t>8</w:t>
             </w:r>
             <w:r>
               <w:rPr>
+                <w:rStyle w:val="Hyperlink"/>
+                <w:b/>
+                <w:bCs/>
+                <w:noProof/>
+                <w:lang w:val="vi-VN"/>
+              </w:rPr>
+              <w:t xml:space="preserve"> . </w:t>
+            </w:r>
+            <w:r>
+              <w:rPr>
+                <w:rStyle w:val="Hyperlink"/>
+                <w:b/>
+                <w:bCs/>
+                <w:noProof/>
+              </w:rPr>
+              <w:t>STEP 8 – Controller (TODO 4–7)</w:t>
+            </w:r>
+            <w:r>
+              <w:rPr>
+                <w:b/>
+                <w:bCs/>
                 <w:noProof/>
                 <w:webHidden/>
               </w:rPr>
@@ -642,6 +942,8 @@
             </w:r>
             <w:r>
               <w:rPr>
+                <w:b/>
+                <w:bCs/>
                 <w:noProof/>
                 <w:webHidden/>
               </w:rPr>
@@ -649,19 +951,25 @@
             </w:r>
             <w:r>
               <w:rPr>
+                <w:b/>
+                <w:bCs/>
                 <w:noProof/>
                 <w:webHidden/>
               </w:rPr>
-              <w:instrText xml:space="preserve"> PAGEREF _Toc243990122 \h </w:instrText>
+              <w:instrText xml:space="preserve"> PAGEREF _Toc243990509 \h </w:instrText>
             </w:r>
             <w:r>
               <w:rPr>
+                <w:b/>
+                <w:bCs/>
                 <w:noProof/>
                 <w:webHidden/>
               </w:rPr>
             </w:r>
             <w:r>
               <w:rPr>
+                <w:b/>
+                <w:bCs/>
                 <w:noProof/>
                 <w:webHidden/>
               </w:rPr>
@@ -669,13 +977,17 @@
             </w:r>
             <w:r>
               <w:rPr>
+                <w:b/>
+                <w:bCs/>
                 <w:noProof/>
                 <w:webHidden/>
               </w:rPr>
-              <w:t>5</w:t>
+              <w:t>4</w:t>
             </w:r>
             <w:r>
               <w:rPr>
+                <w:b/>
+                <w:bCs/>
                 <w:noProof/>
                 <w:webHidden/>
               </w:rPr>
@@ -691,6 +1003,8 @@
             </w:tabs>
             <w:rPr>
               <w:rFonts w:asciiTheme="minorHAnsi" w:eastAsiaTheme="minorEastAsia" w:hAnsiTheme="minorHAnsi"/>
+              <w:b/>
+              <w:bCs/>
               <w:noProof/>
               <w:color w:val="auto"/>
               <w:kern w:val="2"/>
@@ -700,16 +1014,39 @@
               <w14:ligatures w14:val="standardContextual"/>
             </w:rPr>
           </w:pPr>
-          <w:hyperlink w:anchor="_Toc243990123" w:history="1">
+          <w:hyperlink w:anchor="_Toc243990510" w:history="1">
             <w:r>
               <w:rPr>
                 <w:rStyle w:val="Hyperlink"/>
+                <w:b/>
+                <w:bCs/>
                 <w:noProof/>
               </w:rPr>
-              <w:t>9 STEP 9 – Layout chung (TODO 8)</w:t>
+              <w:t>9</w:t>
             </w:r>
             <w:r>
               <w:rPr>
+                <w:rStyle w:val="Hyperlink"/>
+                <w:b/>
+                <w:bCs/>
+                <w:noProof/>
+                <w:lang w:val="vi-VN"/>
+              </w:rPr>
+              <w:t xml:space="preserve"> . </w:t>
+            </w:r>
+            <w:r>
+              <w:rPr>
+                <w:rStyle w:val="Hyperlink"/>
+                <w:b/>
+                <w:bCs/>
+                <w:noProof/>
+              </w:rPr>
+              <w:t>STEP 9 – Layout chung (TODO 8)</w:t>
+            </w:r>
+            <w:r>
+              <w:rPr>
+                <w:b/>
+                <w:bCs/>
                 <w:noProof/>
                 <w:webHidden/>
               </w:rPr>
@@ -717,6 +1054,8 @@
             </w:r>
             <w:r>
               <w:rPr>
+                <w:b/>
+                <w:bCs/>
                 <w:noProof/>
                 <w:webHidden/>
               </w:rPr>
@@ -724,19 +1063,25 @@
             </w:r>
             <w:r>
               <w:rPr>
+                <w:b/>
+                <w:bCs/>
                 <w:noProof/>
                 <w:webHidden/>
               </w:rPr>
-              <w:instrText xml:space="preserve"> PAGEREF _Toc243990123 \h </w:instrText>
+              <w:instrText xml:space="preserve"> PAGEREF _Toc243990510 \h </w:instrText>
             </w:r>
             <w:r>
               <w:rPr>
+                <w:b/>
+                <w:bCs/>
                 <w:noProof/>
                 <w:webHidden/>
               </w:rPr>
             </w:r>
             <w:r>
               <w:rPr>
+                <w:b/>
+                <w:bCs/>
                 <w:noProof/>
                 <w:webHidden/>
               </w:rPr>
@@ -744,13 +1089,17 @@
             </w:r>
             <w:r>
               <w:rPr>
+                <w:b/>
+                <w:bCs/>
                 <w:noProof/>
                 <w:webHidden/>
               </w:rPr>
-              <w:t>6</w:t>
+              <w:t>5</w:t>
             </w:r>
             <w:r>
               <w:rPr>
+                <w:b/>
+                <w:bCs/>
                 <w:noProof/>
                 <w:webHidden/>
               </w:rPr>
@@ -766,6 +1115,8 @@
             </w:tabs>
             <w:rPr>
               <w:rFonts w:asciiTheme="minorHAnsi" w:eastAsiaTheme="minorEastAsia" w:hAnsiTheme="minorHAnsi"/>
+              <w:b/>
+              <w:bCs/>
               <w:noProof/>
               <w:color w:val="auto"/>
               <w:kern w:val="2"/>
@@ -775,16 +1126,39 @@
               <w14:ligatures w14:val="standardContextual"/>
             </w:rPr>
           </w:pPr>
-          <w:hyperlink w:anchor="_Toc243990124" w:history="1">
+          <w:hyperlink w:anchor="_Toc243990511" w:history="1">
             <w:r>
               <w:rPr>
                 <w:rStyle w:val="Hyperlink"/>
+                <w:b/>
+                <w:bCs/>
                 <w:noProof/>
               </w:rPr>
-              <w:t>10 STEP 10 – Trang danh sách (TODO 9–13)</w:t>
+              <w:t>10</w:t>
             </w:r>
             <w:r>
               <w:rPr>
+                <w:rStyle w:val="Hyperlink"/>
+                <w:b/>
+                <w:bCs/>
+                <w:noProof/>
+                <w:lang w:val="vi-VN"/>
+              </w:rPr>
+              <w:t xml:space="preserve"> . </w:t>
+            </w:r>
+            <w:r>
+              <w:rPr>
+                <w:rStyle w:val="Hyperlink"/>
+                <w:b/>
+                <w:bCs/>
+                <w:noProof/>
+              </w:rPr>
+              <w:t>STEP 10 – Trang danh sách (TODO 9–13)</w:t>
+            </w:r>
+            <w:r>
+              <w:rPr>
+                <w:b/>
+                <w:bCs/>
                 <w:noProof/>
                 <w:webHidden/>
               </w:rPr>
@@ -792,6 +1166,8 @@
             </w:r>
             <w:r>
               <w:rPr>
+                <w:b/>
+                <w:bCs/>
                 <w:noProof/>
                 <w:webHidden/>
               </w:rPr>
@@ -799,19 +1175,25 @@
             </w:r>
             <w:r>
               <w:rPr>
+                <w:b/>
+                <w:bCs/>
                 <w:noProof/>
                 <w:webHidden/>
               </w:rPr>
-              <w:instrText xml:space="preserve"> PAGEREF _Toc243990124 \h </w:instrText>
+              <w:instrText xml:space="preserve"> PAGEREF _Toc243990511 \h </w:instrText>
             </w:r>
             <w:r>
               <w:rPr>
+                <w:b/>
+                <w:bCs/>
                 <w:noProof/>
                 <w:webHidden/>
               </w:rPr>
             </w:r>
             <w:r>
               <w:rPr>
+                <w:b/>
+                <w:bCs/>
                 <w:noProof/>
                 <w:webHidden/>
               </w:rPr>
@@ -819,13 +1201,17 @@
             </w:r>
             <w:r>
               <w:rPr>
+                <w:b/>
+                <w:bCs/>
                 <w:noProof/>
                 <w:webHidden/>
               </w:rPr>
-              <w:t>7</w:t>
+              <w:t>6</w:t>
             </w:r>
             <w:r>
               <w:rPr>
+                <w:b/>
+                <w:bCs/>
                 <w:noProof/>
                 <w:webHidden/>
               </w:rPr>
@@ -841,6 +1227,8 @@
             </w:tabs>
             <w:rPr>
               <w:rFonts w:asciiTheme="minorHAnsi" w:eastAsiaTheme="minorEastAsia" w:hAnsiTheme="minorHAnsi"/>
+              <w:b/>
+              <w:bCs/>
               <w:noProof/>
               <w:color w:val="auto"/>
               <w:kern w:val="2"/>
@@ -850,16 +1238,39 @@
               <w14:ligatures w14:val="standardContextual"/>
             </w:rPr>
           </w:pPr>
-          <w:hyperlink w:anchor="_Toc243990125" w:history="1">
+          <w:hyperlink w:anchor="_Toc243990512" w:history="1">
             <w:r>
               <w:rPr>
                 <w:rStyle w:val="Hyperlink"/>
+                <w:b/>
+                <w:bCs/>
                 <w:noProof/>
               </w:rPr>
-              <w:t>11 STEP 11 – Trang chi tiết (TODO 14)</w:t>
+              <w:t>11</w:t>
             </w:r>
             <w:r>
               <w:rPr>
+                <w:rStyle w:val="Hyperlink"/>
+                <w:b/>
+                <w:bCs/>
+                <w:noProof/>
+                <w:lang w:val="vi-VN"/>
+              </w:rPr>
+              <w:t xml:space="preserve"> . </w:t>
+            </w:r>
+            <w:r>
+              <w:rPr>
+                <w:rStyle w:val="Hyperlink"/>
+                <w:b/>
+                <w:bCs/>
+                <w:noProof/>
+              </w:rPr>
+              <w:t>STEP 11 – Trang chi tiết (TODO 14)</w:t>
+            </w:r>
+            <w:r>
+              <w:rPr>
+                <w:b/>
+                <w:bCs/>
                 <w:noProof/>
                 <w:webHidden/>
               </w:rPr>
@@ -867,6 +1278,8 @@
             </w:r>
             <w:r>
               <w:rPr>
+                <w:b/>
+                <w:bCs/>
                 <w:noProof/>
                 <w:webHidden/>
               </w:rPr>
@@ -874,19 +1287,25 @@
             </w:r>
             <w:r>
               <w:rPr>
+                <w:b/>
+                <w:bCs/>
                 <w:noProof/>
                 <w:webHidden/>
               </w:rPr>
-              <w:instrText xml:space="preserve"> PAGEREF _Toc243990125 \h </w:instrText>
+              <w:instrText xml:space="preserve"> PAGEREF _Toc243990512 \h </w:instrText>
             </w:r>
             <w:r>
               <w:rPr>
+                <w:b/>
+                <w:bCs/>
                 <w:noProof/>
                 <w:webHidden/>
               </w:rPr>
             </w:r>
             <w:r>
               <w:rPr>
+                <w:b/>
+                <w:bCs/>
                 <w:noProof/>
                 <w:webHidden/>
               </w:rPr>
@@ -894,13 +1313,17 @@
             </w:r>
             <w:r>
               <w:rPr>
+                <w:b/>
+                <w:bCs/>
                 <w:noProof/>
                 <w:webHidden/>
               </w:rPr>
-              <w:t>9</w:t>
+              <w:t>8</w:t>
             </w:r>
             <w:r>
               <w:rPr>
+                <w:b/>
+                <w:bCs/>
                 <w:noProof/>
                 <w:webHidden/>
               </w:rPr>
@@ -916,6 +1339,8 @@
             </w:tabs>
             <w:rPr>
               <w:rFonts w:asciiTheme="minorHAnsi" w:eastAsiaTheme="minorEastAsia" w:hAnsiTheme="minorHAnsi"/>
+              <w:b/>
+              <w:bCs/>
               <w:noProof/>
               <w:color w:val="auto"/>
               <w:kern w:val="2"/>
@@ -925,16 +1350,58 @@
               <w14:ligatures w14:val="standardContextual"/>
             </w:rPr>
           </w:pPr>
-          <w:hyperlink w:anchor="_Toc243990126" w:history="1">
+          <w:hyperlink w:anchor="_Toc243990513" w:history="1">
             <w:r>
               <w:rPr>
                 <w:rStyle w:val="Hyperlink"/>
+                <w:b/>
+                <w:bCs/>
                 <w:noProof/>
               </w:rPr>
-              <w:t>12 STEP 12 – Form thêm/sửa có validation (TODO 15–16)</w:t>
+              <w:t>12</w:t>
             </w:r>
             <w:r>
               <w:rPr>
+                <w:rStyle w:val="Hyperlink"/>
+                <w:b/>
+                <w:bCs/>
+                <w:noProof/>
+                <w:lang w:val="vi-VN"/>
+              </w:rPr>
+              <w:t xml:space="preserve"> . </w:t>
+            </w:r>
+            <w:r>
+              <w:rPr>
+                <w:rStyle w:val="Hyperlink"/>
+                <w:b/>
+                <w:bCs/>
+                <w:noProof/>
+              </w:rPr>
+              <w:t>STEP 12 – Form thêm/sửa có validation (TODO 15</w:t>
+            </w:r>
+            <w:r>
+              <w:rPr>
+                <w:rStyle w:val="Hyperlink"/>
+                <w:b/>
+                <w:bCs/>
+                <w:noProof/>
+                <w:lang w:val="vi-VN"/>
+              </w:rPr>
+              <w:t>-</w:t>
+            </w:r>
+            <w:r>
+              <w:rPr>
+                <w:rStyle w:val="Hyperlink"/>
+                <w:b/>
+                <w:bCs/>
+                <w:noProof/>
+              </w:rPr>
+              <w:t>16)</w:t>
+            </w:r>
+            <w:r>
+              <w:rPr>
+                <w:b/>
+                <w:bCs/>
                 <w:noProof/>
                 <w:webHidden/>
               </w:rPr>
@@ -942,6 +1409,8 @@
             </w:r>
             <w:r>
               <w:rPr>
+                <w:b/>
+                <w:bCs/>
                 <w:noProof/>
                 <w:webHidden/>
               </w:rPr>
@@ -949,19 +1418,25 @@
             </w:r>
             <w:r>
               <w:rPr>
+                <w:b/>
+                <w:bCs/>
                 <w:noProof/>
                 <w:webHidden/>
               </w:rPr>
-              <w:instrText xml:space="preserve"> PAGEREF _Toc243990126 \h </w:instrText>
+              <w:instrText xml:space="preserve"> PAGEREF _Toc243990513 \h </w:instrText>
             </w:r>
             <w:r>
               <w:rPr>
+                <w:b/>
+                <w:bCs/>
                 <w:noProof/>
                 <w:webHidden/>
               </w:rPr>
             </w:r>
             <w:r>
               <w:rPr>
+                <w:b/>
+                <w:bCs/>
                 <w:noProof/>
                 <w:webHidden/>
               </w:rPr>
@@ -969,13 +1444,17 @@
             </w:r>
             <w:r>
               <w:rPr>
+                <w:b/>
+                <w:bCs/>
                 <w:noProof/>
                 <w:webHidden/>
               </w:rPr>
-              <w:t>9</w:t>
+              <w:t>8</w:t>
             </w:r>
             <w:r>
               <w:rPr>
+                <w:b/>
+                <w:bCs/>
                 <w:noProof/>
                 <w:webHidden/>
               </w:rPr>
@@ -991,6 +1470,8 @@
             </w:tabs>
             <w:rPr>
               <w:rFonts w:asciiTheme="minorHAnsi" w:eastAsiaTheme="minorEastAsia" w:hAnsiTheme="minorHAnsi"/>
+              <w:b/>
+              <w:bCs/>
               <w:noProof/>
               <w:color w:val="auto"/>
               <w:kern w:val="2"/>
@@ -1000,16 +1481,20 @@
               <w14:ligatures w14:val="standardContextual"/>
             </w:rPr>
           </w:pPr>
-          <w:hyperlink w:anchor="_Toc243990127" w:history="1">
+          <w:hyperlink w:anchor="_Toc243990514" w:history="1">
             <w:r>
               <w:rPr>
                 <w:rStyle w:val="Hyperlink"/>
+                <w:b/>
+                <w:bCs/>
                 <w:noProof/>
               </w:rPr>
               <w:t>13 STEP 13 – Chạy ứng dụng</w:t>
             </w:r>
             <w:r>
               <w:rPr>
+                <w:b/>
+                <w:bCs/>
                 <w:noProof/>
                 <w:webHidden/>
               </w:rPr>
@@ -1017,6 +1502,8 @@
             </w:r>
             <w:r>
               <w:rPr>
+                <w:b/>
+                <w:bCs/>
                 <w:noProof/>
                 <w:webHidden/>
               </w:rPr>
@@ -1024,19 +1511,25 @@
             </w:r>
             <w:r>
               <w:rPr>
+                <w:b/>
+                <w:bCs/>
                 <w:noProof/>
                 <w:webHidden/>
               </w:rPr>
-              <w:instrText xml:space="preserve"> PAGEREF _Toc243990127 \h </w:instrText>
+              <w:instrText xml:space="preserve"> PAGEREF _Toc243990514 \h </w:instrText>
             </w:r>
             <w:r>
               <w:rPr>
+                <w:b/>
+                <w:bCs/>
                 <w:noProof/>
                 <w:webHidden/>
               </w:rPr>
             </w:r>
             <w:r>
               <w:rPr>
+                <w:b/>
+                <w:bCs/>
                 <w:noProof/>
                 <w:webHidden/>
               </w:rPr>
@@ -1044,13 +1537,17 @@
             </w:r>
             <w:r>
               <w:rPr>
+                <w:b/>
+                <w:bCs/>
                 <w:noProof/>
                 <w:webHidden/>
               </w:rPr>
-              <w:t>11</w:t>
+              <w:t>10</w:t>
             </w:r>
             <w:r>
               <w:rPr>
+                <w:b/>
+                <w:bCs/>
                 <w:noProof/>
                 <w:webHidden/>
               </w:rPr>
@@ -1066,6 +1563,8 @@
             </w:tabs>
             <w:rPr>
               <w:rFonts w:asciiTheme="minorHAnsi" w:eastAsiaTheme="minorEastAsia" w:hAnsiTheme="minorHAnsi"/>
+              <w:b/>
+              <w:bCs/>
               <w:noProof/>
               <w:color w:val="auto"/>
               <w:kern w:val="2"/>
@@ -1075,16 +1574,20 @@
               <w14:ligatures w14:val="standardContextual"/>
             </w:rPr>
           </w:pPr>
-          <w:hyperlink w:anchor="_Toc243990128" w:history="1">
+          <w:hyperlink w:anchor="_Toc243990515" w:history="1">
             <w:r>
               <w:rPr>
                 <w:rStyle w:val="Hyperlink"/>
+                <w:b/>
+                <w:bCs/>
                 <w:noProof/>
               </w:rPr>
               <w:t>14 Kết quả tổng hợp</w:t>
             </w:r>
             <w:r>
               <w:rPr>
+                <w:b/>
+                <w:bCs/>
                 <w:noProof/>
                 <w:webHidden/>
               </w:rPr>
@@ -1092,6 +1595,8 @@
             </w:r>
             <w:r>
               <w:rPr>
+                <w:b/>
+                <w:bCs/>
                 <w:noProof/>
                 <w:webHidden/>
               </w:rPr>
@@ -1099,19 +1604,25 @@
             </w:r>
             <w:r>
               <w:rPr>
+                <w:b/>
+                <w:bCs/>
                 <w:noProof/>
                 <w:webHidden/>
               </w:rPr>
-              <w:instrText xml:space="preserve"> PAGEREF _Toc243990128 \h </w:instrText>
+              <w:instrText xml:space="preserve"> PAGEREF _Toc243990515 \h </w:instrText>
             </w:r>
             <w:r>
               <w:rPr>
+                <w:b/>
+                <w:bCs/>
                 <w:noProof/>
                 <w:webHidden/>
               </w:rPr>
             </w:r>
             <w:r>
               <w:rPr>
+                <w:b/>
+                <w:bCs/>
                 <w:noProof/>
                 <w:webHidden/>
               </w:rPr>
@@ -1119,13 +1630,17 @@
             </w:r>
             <w:r>
               <w:rPr>
+                <w:b/>
+                <w:bCs/>
                 <w:noProof/>
                 <w:webHidden/>
               </w:rPr>
-              <w:t>13</w:t>
+              <w:t>12</w:t>
             </w:r>
             <w:r>
               <w:rPr>
+                <w:b/>
+                <w:bCs/>
                 <w:noProof/>
                 <w:webHidden/>
               </w:rPr>
@@ -1154,7 +1669,7 @@
         </w:numPr>
         <w:spacing w:before="160" w:after="100"/>
       </w:pPr>
-      <w:bookmarkStart w:id="0" w:name="_Toc243990115"/>
+      <w:bookmarkStart w:id="0" w:name="_Toc243990502"/>
       <w:r>
         <w:rPr>
           <w:rFonts w:ascii="Times New Roman" w:eastAsia="Times New Roman" w:hAnsi="Times New Roman"/>
@@ -1263,7 +1778,7 @@
         </w:numPr>
         <w:spacing w:before="160" w:after="100"/>
       </w:pPr>
-      <w:bookmarkStart w:id="1" w:name="_Toc243990116"/>
+      <w:bookmarkStart w:id="1" w:name="_Toc243990503"/>
       <w:r>
         <w:rPr>
           <w:rFonts w:ascii="Times New Roman" w:eastAsia="Times New Roman" w:hAnsi="Times New Roman"/>
@@ -1299,7 +1814,7 @@
         </w:numPr>
         <w:spacing w:before="160" w:after="100"/>
       </w:pPr>
-      <w:bookmarkStart w:id="2" w:name="_Toc243990117"/>
+      <w:bookmarkStart w:id="2" w:name="_Toc243990504"/>
       <w:r>
         <w:rPr>
           <w:rFonts w:ascii="Times New Roman" w:eastAsia="Times New Roman" w:hAnsi="Times New Roman"/>
@@ -1362,7 +1877,7 @@
         </w:numPr>
         <w:spacing w:before="160" w:after="100"/>
       </w:pPr>
-      <w:bookmarkStart w:id="3" w:name="_Toc243990118"/>
+      <w:bookmarkStart w:id="3" w:name="_Toc243990505"/>
       <w:r>
         <w:rPr>
           <w:rFonts w:ascii="Times New Roman" w:eastAsia="Times New Roman" w:hAnsi="Times New Roman"/>
@@ -1404,6 +1919,7 @@
         </w:rPr>
         <w:t xml:space="preserve"> </w:t>
       </w:r>
+      <w:proofErr w:type="spellStart"/>
       <w:proofErr w:type="gramStart"/>
       <w:r>
         <w:rPr>
@@ -1411,12 +1927,27 @@
         </w:rPr>
         <w:t>application.properties</w:t>
       </w:r>
+      <w:proofErr w:type="spellEnd"/>
       <w:proofErr w:type="gramEnd"/>
       <w:r>
         <w:rPr>
           <w:rFonts w:ascii="Times New Roman" w:eastAsia="Times New Roman" w:hAnsi="Times New Roman"/>
         </w:rPr>
-        <w:t xml:space="preserve"> và </w:t>
+        <w:t xml:space="preserve"> </w:t>
+      </w:r>
+      <w:proofErr w:type="spellStart"/>
+      <w:r>
+        <w:rPr>
+          <w:rFonts w:ascii="Times New Roman" w:eastAsia="Times New Roman" w:hAnsi="Times New Roman"/>
+        </w:rPr>
+        <w:t>và</w:t>
+      </w:r>
+      <w:proofErr w:type="spellEnd"/>
+      <w:r>
+        <w:rPr>
+          <w:rFonts w:ascii="Times New Roman" w:eastAsia="Times New Roman" w:hAnsi="Times New Roman"/>
+        </w:rPr>
+        <w:t xml:space="preserve"> </w:t>
       </w:r>
       <w:proofErr w:type="gramStart"/>
       <w:r>
@@ -1502,7 +2033,7 @@
         </w:numPr>
         <w:spacing w:before="160" w:after="100"/>
       </w:pPr>
-      <w:bookmarkStart w:id="4" w:name="_Toc243990119"/>
+      <w:bookmarkStart w:id="4" w:name="_Toc243990506"/>
       <w:r>
         <w:rPr>
           <w:rFonts w:ascii="Times New Roman" w:eastAsia="Times New Roman" w:hAnsi="Times New Roman"/>
@@ -1593,7 +2124,7 @@
         </w:numPr>
         <w:spacing w:before="160" w:after="100"/>
       </w:pPr>
-      <w:bookmarkStart w:id="5" w:name="_Toc243990120"/>
+      <w:bookmarkStart w:id="5" w:name="_Toc243990507"/>
       <w:r>
         <w:rPr>
           <w:rFonts w:ascii="Times New Roman" w:eastAsia="Times New Roman" w:hAnsi="Times New Roman"/>
@@ -1628,7 +2159,7 @@
         </w:numPr>
         <w:spacing w:before="160" w:after="100"/>
       </w:pPr>
-      <w:bookmarkStart w:id="6" w:name="_Toc243990121"/>
+      <w:bookmarkStart w:id="6" w:name="_Toc243990508"/>
       <w:r>
         <w:rPr>
           <w:rFonts w:ascii="Times New Roman" w:eastAsia="Times New Roman" w:hAnsi="Times New Roman"/>
@@ -1719,7 +2250,7 @@
         </w:numPr>
         <w:spacing w:before="160" w:after="100"/>
       </w:pPr>
-      <w:bookmarkStart w:id="7" w:name="_Toc243990122"/>
+      <w:bookmarkStart w:id="7" w:name="_Toc243990509"/>
       <w:r>
         <w:rPr>
           <w:rFonts w:ascii="Times New Roman" w:eastAsia="Times New Roman" w:hAnsi="Times New Roman"/>
@@ -1920,7 +2451,7 @@
         </w:numPr>
         <w:spacing w:before="160" w:after="100"/>
       </w:pPr>
-      <w:bookmarkStart w:id="8" w:name="_Toc243990123"/>
+      <w:bookmarkStart w:id="8" w:name="_Toc243990510"/>
       <w:r>
         <w:rPr>
           <w:rFonts w:ascii="Times New Roman" w:eastAsia="Times New Roman" w:hAnsi="Times New Roman"/>
@@ -2025,7 +2556,7 @@
         </w:numPr>
         <w:spacing w:before="160" w:after="100"/>
       </w:pPr>
-      <w:bookmarkStart w:id="9" w:name="_Toc243990124"/>
+      <w:bookmarkStart w:id="9" w:name="_Toc243990511"/>
       <w:r>
         <w:rPr>
           <w:rFonts w:ascii="Times New Roman" w:eastAsia="Times New Roman" w:hAnsi="Times New Roman"/>
@@ -2051,7 +2582,21 @@
         <w:rPr>
           <w:rFonts w:ascii="Times New Roman" w:eastAsia="Times New Roman" w:hAnsi="Times New Roman"/>
         </w:rPr>
-        <w:t xml:space="preserve"> sách (TODO 9–13)</w:t>
+        <w:t xml:space="preserve"> </w:t>
+      </w:r>
+      <w:proofErr w:type="spellStart"/>
+      <w:r>
+        <w:rPr>
+          <w:rFonts w:ascii="Times New Roman" w:eastAsia="Times New Roman" w:hAnsi="Times New Roman"/>
+        </w:rPr>
+        <w:t>sách</w:t>
+      </w:r>
+      <w:proofErr w:type="spellEnd"/>
+      <w:r>
+        <w:rPr>
+          <w:rFonts w:ascii="Times New Roman" w:eastAsia="Times New Roman" w:hAnsi="Times New Roman"/>
+        </w:rPr>
+        <w:t xml:space="preserve"> (TODO 9–13)</w:t>
       </w:r>
       <w:bookmarkEnd w:id="9"/>
     </w:p>
@@ -2240,7 +2785,7 @@
         </w:numPr>
         <w:spacing w:before="160" w:after="100"/>
       </w:pPr>
-      <w:bookmarkStart w:id="10" w:name="_Toc243990125"/>
+      <w:bookmarkStart w:id="10" w:name="_Toc243990512"/>
       <w:r>
         <w:rPr>
           <w:rFonts w:ascii="Times New Roman" w:eastAsia="Times New Roman" w:hAnsi="Times New Roman"/>
@@ -2331,7 +2876,7 @@
         </w:numPr>
         <w:spacing w:before="160" w:after="100"/>
       </w:pPr>
-      <w:bookmarkStart w:id="11" w:name="_Toc243990126"/>
+      <w:bookmarkStart w:id="11" w:name="_Toc243990513"/>
       <w:r>
         <w:rPr>
           <w:rFonts w:ascii="Times New Roman" w:eastAsia="Times New Roman" w:hAnsi="Times New Roman"/>
@@ -2385,13 +2930,7 @@
         <w:rPr>
           <w:rFonts w:ascii="Times New Roman" w:eastAsia="Times New Roman" w:hAnsi="Times New Roman"/>
         </w:rPr>
-        <w:t xml:space="preserve"> validation (TODO </w:t>
-      </w:r>
-      <w:r>
-        <w:rPr>
-          <w:rFonts w:ascii="Times New Roman" w:eastAsia="Times New Roman" w:hAnsi="Times New Roman"/>
-        </w:rPr>
-        <w:t>15</w:t>
+        <w:t xml:space="preserve"> validation (TODO 15</w:t>
       </w:r>
       <w:r>
         <w:rPr>
@@ -2649,7 +3188,7 @@
         </w:numPr>
         <w:spacing w:before="160" w:after="100"/>
       </w:pPr>
-      <w:bookmarkStart w:id="12" w:name="_Toc243990127"/>
+      <w:bookmarkStart w:id="12" w:name="_Toc243990514"/>
       <w:r>
         <w:rPr>
           <w:rFonts w:ascii="Times New Roman" w:eastAsia="Times New Roman" w:hAnsi="Times New Roman"/>
@@ -2899,7 +3438,7 @@
         </w:numPr>
         <w:spacing w:before="160" w:after="100"/>
       </w:pPr>
-      <w:bookmarkStart w:id="13" w:name="_Toc243990128"/>
+      <w:bookmarkStart w:id="13" w:name="_Toc243990515"/>
       <w:r>
         <w:rPr>
           <w:rFonts w:ascii="Times New Roman" w:eastAsia="Times New Roman" w:hAnsi="Times New Roman"/>

</xml_diff>